<commit_message>
Lab 5 Task 1 Only Diagram Added
</commit_message>
<xml_diff>
--- a/Lab 5/TASK 1/Lab - 1.docx
+++ b/Lab 5/TASK 1/Lab - 1.docx
@@ -33,7 +33,7 @@
                     </pic:cNvPicPr>
                   </pic:nvPicPr>
                   <pic:blipFill>
-                    <a:blip r:embed="rId6">
+                    <a:blip r:embed="rId8">
                       <a:extLst>
                         <a:ext uri="{28A0092B-C50C-407E-A947-70E740481C1C}">
                           <a14:useLocalDpi xmlns:a14="http://schemas.microsoft.com/office/drawing/2010/main" val="0"/>
@@ -108,8 +108,13 @@
         <w:jc w:val="center"/>
       </w:pPr>
       <w:r>
-        <w:t>Muhammad Ahmed Subhani</w:t>
-      </w:r>
+        <w:t xml:space="preserve">Muhammad Ahmed </w:t>
+      </w:r>
+      <w:proofErr w:type="spellStart"/>
+      <w:r>
+        <w:t>Subhani</w:t>
+      </w:r>
+      <w:proofErr w:type="spellEnd"/>
     </w:p>
     <w:p>
       <w:pPr>
@@ -198,7 +203,15 @@
         <w:jc w:val="center"/>
       </w:pPr>
       <w:r>
-        <w:t>Sir Rasikh Ali</w:t>
+        <w:t xml:space="preserve">Sir </w:t>
+      </w:r>
+      <w:proofErr w:type="spellStart"/>
+      <w:r>
+        <w:t>Rasikh</w:t>
+      </w:r>
+      <w:proofErr w:type="spellEnd"/>
+      <w:r>
+        <w:t xml:space="preserve"> Ali</w:t>
       </w:r>
     </w:p>
     <w:p>
@@ -267,7 +280,400 @@
         </w:rPr>
         <w:t>Superior University, Lahore</w:t>
       </w:r>
-    </w:p>
+      <w:bookmarkStart w:id="0" w:name="_GoBack"/>
+      <w:bookmarkEnd w:id="0"/>
+    </w:p>
+    <w:sdt>
+      <w:sdtPr>
+        <w:rPr>
+          <w:rFonts w:ascii="Times New Roman" w:hAnsi="Times New Roman" w:cs="Times New Roman"/>
+          <w:b/>
+          <w:color w:val="auto"/>
+        </w:rPr>
+        <w:id w:val="898479957"/>
+        <w:docPartObj>
+          <w:docPartGallery w:val="Table of Contents"/>
+          <w:docPartUnique/>
+        </w:docPartObj>
+      </w:sdtPr>
+      <w:sdtEndPr>
+        <w:rPr>
+          <w:rFonts w:asciiTheme="minorHAnsi" w:eastAsiaTheme="minorHAnsi" w:hAnsiTheme="minorHAnsi" w:cstheme="minorBidi"/>
+          <w:bCs/>
+          <w:noProof/>
+          <w:sz w:val="22"/>
+          <w:szCs w:val="22"/>
+        </w:rPr>
+      </w:sdtEndPr>
+      <w:sdtContent>
+        <w:p>
+          <w:pPr>
+            <w:pStyle w:val="TOCHeading"/>
+            <w:rPr>
+              <w:rFonts w:ascii="Times New Roman" w:hAnsi="Times New Roman" w:cs="Times New Roman"/>
+              <w:b/>
+              <w:color w:val="auto"/>
+            </w:rPr>
+          </w:pPr>
+          <w:r>
+            <w:rPr>
+              <w:rFonts w:ascii="Times New Roman" w:hAnsi="Times New Roman" w:cs="Times New Roman"/>
+              <w:b/>
+              <w:color w:val="auto"/>
+            </w:rPr>
+            <w:t>Table of Contents</w:t>
+          </w:r>
+        </w:p>
+        <w:p>
+          <w:pPr>
+            <w:pStyle w:val="TOC1"/>
+            <w:tabs>
+              <w:tab w:val="right" w:leader="dot" w:pos="9350"/>
+            </w:tabs>
+            <w:rPr>
+              <w:rFonts w:eastAsiaTheme="minorEastAsia"/>
+              <w:noProof/>
+            </w:rPr>
+          </w:pPr>
+          <w:r>
+            <w:fldChar w:fldCharType="begin"/>
+          </w:r>
+          <w:r>
+            <w:instrText xml:space="preserve"> TOC \o "1-3" \h \z \u </w:instrText>
+          </w:r>
+          <w:r>
+            <w:fldChar w:fldCharType="separate"/>
+          </w:r>
+          <w:hyperlink w:anchor="_Toc243584606" w:history="1">
+            <w:r>
+              <w:rPr>
+                <w:rStyle w:val="Hyperlink"/>
+                <w:rFonts w:ascii="Times New Roman" w:hAnsi="Times New Roman" w:cs="Times New Roman"/>
+                <w:b/>
+                <w:noProof/>
+              </w:rPr>
+              <w:t>Using Minimax</w:t>
+            </w:r>
+            <w:r>
+              <w:rPr>
+                <w:noProof/>
+                <w:webHidden/>
+              </w:rPr>
+              <w:tab/>
+            </w:r>
+            <w:r>
+              <w:rPr>
+                <w:noProof/>
+                <w:webHidden/>
+              </w:rPr>
+              <w:fldChar w:fldCharType="begin"/>
+            </w:r>
+            <w:r>
+              <w:rPr>
+                <w:noProof/>
+                <w:webHidden/>
+              </w:rPr>
+              <w:instrText xml:space="preserve"> PAGEREF _Toc243584606 \h </w:instrText>
+            </w:r>
+            <w:r>
+              <w:rPr>
+                <w:noProof/>
+                <w:webHidden/>
+              </w:rPr>
+            </w:r>
+            <w:r>
+              <w:rPr>
+                <w:noProof/>
+                <w:webHidden/>
+              </w:rPr>
+              <w:fldChar w:fldCharType="separate"/>
+            </w:r>
+            <w:r>
+              <w:rPr>
+                <w:noProof/>
+                <w:webHidden/>
+              </w:rPr>
+              <w:t>3</w:t>
+            </w:r>
+            <w:r>
+              <w:rPr>
+                <w:noProof/>
+                <w:webHidden/>
+              </w:rPr>
+              <w:fldChar w:fldCharType="end"/>
+            </w:r>
+          </w:hyperlink>
+        </w:p>
+        <w:p>
+          <w:pPr>
+            <w:pStyle w:val="TOC2"/>
+            <w:tabs>
+              <w:tab w:val="left" w:pos="660"/>
+              <w:tab w:val="right" w:leader="dot" w:pos="9350"/>
+            </w:tabs>
+            <w:rPr>
+              <w:noProof/>
+            </w:rPr>
+          </w:pPr>
+          <w:hyperlink w:anchor="_Toc243584607" w:history="1">
+            <w:r>
+              <w:rPr>
+                <w:rStyle w:val="Hyperlink"/>
+                <w:rFonts w:ascii="Times New Roman" w:hAnsi="Times New Roman" w:cs="Times New Roman"/>
+                <w:b/>
+                <w:noProof/>
+              </w:rPr>
+              <w:t>1.</w:t>
+            </w:r>
+            <w:r>
+              <w:rPr>
+                <w:noProof/>
+              </w:rPr>
+              <w:tab/>
+            </w:r>
+            <w:r>
+              <w:rPr>
+                <w:rStyle w:val="Hyperlink"/>
+                <w:rFonts w:ascii="Times New Roman" w:hAnsi="Times New Roman" w:cs="Times New Roman"/>
+                <w:b/>
+                <w:noProof/>
+              </w:rPr>
+              <w:t>Given data</w:t>
+            </w:r>
+            <w:r>
+              <w:rPr>
+                <w:noProof/>
+                <w:webHidden/>
+              </w:rPr>
+              <w:tab/>
+            </w:r>
+            <w:r>
+              <w:rPr>
+                <w:noProof/>
+                <w:webHidden/>
+              </w:rPr>
+              <w:fldChar w:fldCharType="begin"/>
+            </w:r>
+            <w:r>
+              <w:rPr>
+                <w:noProof/>
+                <w:webHidden/>
+              </w:rPr>
+              <w:instrText xml:space="preserve"> PAGEREF _Toc243584607 \h </w:instrText>
+            </w:r>
+            <w:r>
+              <w:rPr>
+                <w:noProof/>
+                <w:webHidden/>
+              </w:rPr>
+            </w:r>
+            <w:r>
+              <w:rPr>
+                <w:noProof/>
+                <w:webHidden/>
+              </w:rPr>
+              <w:fldChar w:fldCharType="separate"/>
+            </w:r>
+            <w:r>
+              <w:rPr>
+                <w:noProof/>
+                <w:webHidden/>
+              </w:rPr>
+              <w:t>3</w:t>
+            </w:r>
+            <w:r>
+              <w:rPr>
+                <w:noProof/>
+                <w:webHidden/>
+              </w:rPr>
+              <w:fldChar w:fldCharType="end"/>
+            </w:r>
+          </w:hyperlink>
+        </w:p>
+        <w:p>
+          <w:pPr>
+            <w:pStyle w:val="TOC2"/>
+            <w:tabs>
+              <w:tab w:val="left" w:pos="660"/>
+              <w:tab w:val="right" w:leader="dot" w:pos="9350"/>
+            </w:tabs>
+            <w:rPr>
+              <w:noProof/>
+            </w:rPr>
+          </w:pPr>
+          <w:hyperlink w:anchor="_Toc243584608" w:history="1">
+            <w:r>
+              <w:rPr>
+                <w:rStyle w:val="Hyperlink"/>
+                <w:rFonts w:ascii="Times New Roman" w:hAnsi="Times New Roman" w:cs="Times New Roman"/>
+                <w:b/>
+                <w:noProof/>
+              </w:rPr>
+              <w:t>2.</w:t>
+            </w:r>
+            <w:r>
+              <w:rPr>
+                <w:noProof/>
+              </w:rPr>
+              <w:tab/>
+            </w:r>
+            <w:r>
+              <w:rPr>
+                <w:rStyle w:val="Hyperlink"/>
+                <w:rFonts w:ascii="Times New Roman" w:hAnsi="Times New Roman" w:cs="Times New Roman"/>
+                <w:b/>
+                <w:noProof/>
+              </w:rPr>
+              <w:t>Diagram</w:t>
+            </w:r>
+            <w:r>
+              <w:rPr>
+                <w:noProof/>
+                <w:webHidden/>
+              </w:rPr>
+              <w:tab/>
+            </w:r>
+            <w:r>
+              <w:rPr>
+                <w:noProof/>
+                <w:webHidden/>
+              </w:rPr>
+              <w:fldChar w:fldCharType="begin"/>
+            </w:r>
+            <w:r>
+              <w:rPr>
+                <w:noProof/>
+                <w:webHidden/>
+              </w:rPr>
+              <w:instrText xml:space="preserve"> PAGEREF _Toc243584608 \h </w:instrText>
+            </w:r>
+            <w:r>
+              <w:rPr>
+                <w:noProof/>
+                <w:webHidden/>
+              </w:rPr>
+            </w:r>
+            <w:r>
+              <w:rPr>
+                <w:noProof/>
+                <w:webHidden/>
+              </w:rPr>
+              <w:fldChar w:fldCharType="separate"/>
+            </w:r>
+            <w:r>
+              <w:rPr>
+                <w:noProof/>
+                <w:webHidden/>
+              </w:rPr>
+              <w:t>3</w:t>
+            </w:r>
+            <w:r>
+              <w:rPr>
+                <w:noProof/>
+                <w:webHidden/>
+              </w:rPr>
+              <w:fldChar w:fldCharType="end"/>
+            </w:r>
+          </w:hyperlink>
+        </w:p>
+        <w:p>
+          <w:pPr>
+            <w:pStyle w:val="TOC2"/>
+            <w:tabs>
+              <w:tab w:val="left" w:pos="660"/>
+              <w:tab w:val="right" w:leader="dot" w:pos="9350"/>
+            </w:tabs>
+            <w:rPr>
+              <w:noProof/>
+            </w:rPr>
+          </w:pPr>
+          <w:hyperlink w:anchor="_Toc243584609" w:history="1">
+            <w:r>
+              <w:rPr>
+                <w:rStyle w:val="Hyperlink"/>
+                <w:rFonts w:ascii="Times New Roman" w:hAnsi="Times New Roman" w:cs="Times New Roman"/>
+                <w:b/>
+                <w:noProof/>
+              </w:rPr>
+              <w:t>3.</w:t>
+            </w:r>
+            <w:r>
+              <w:rPr>
+                <w:noProof/>
+              </w:rPr>
+              <w:tab/>
+            </w:r>
+            <w:r>
+              <w:rPr>
+                <w:rStyle w:val="Hyperlink"/>
+                <w:rFonts w:ascii="Times New Roman" w:hAnsi="Times New Roman" w:cs="Times New Roman"/>
+                <w:b/>
+                <w:noProof/>
+              </w:rPr>
+              <w:t>Calculation</w:t>
+            </w:r>
+            <w:r>
+              <w:rPr>
+                <w:noProof/>
+                <w:webHidden/>
+              </w:rPr>
+              <w:tab/>
+            </w:r>
+            <w:r>
+              <w:rPr>
+                <w:noProof/>
+                <w:webHidden/>
+              </w:rPr>
+              <w:fldChar w:fldCharType="begin"/>
+            </w:r>
+            <w:r>
+              <w:rPr>
+                <w:noProof/>
+                <w:webHidden/>
+              </w:rPr>
+              <w:instrText xml:space="preserve"> PAGEREF _Toc243584609 \h </w:instrText>
+            </w:r>
+            <w:r>
+              <w:rPr>
+                <w:noProof/>
+                <w:webHidden/>
+              </w:rPr>
+            </w:r>
+            <w:r>
+              <w:rPr>
+                <w:noProof/>
+                <w:webHidden/>
+              </w:rPr>
+              <w:fldChar w:fldCharType="separate"/>
+            </w:r>
+            <w:r>
+              <w:rPr>
+                <w:noProof/>
+                <w:webHidden/>
+              </w:rPr>
+              <w:t>4</w:t>
+            </w:r>
+            <w:r>
+              <w:rPr>
+                <w:noProof/>
+                <w:webHidden/>
+              </w:rPr>
+              <w:fldChar w:fldCharType="end"/>
+            </w:r>
+          </w:hyperlink>
+        </w:p>
+        <w:p>
+          <w:r>
+            <w:rPr>
+              <w:b/>
+              <w:bCs/>
+              <w:noProof/>
+            </w:rPr>
+            <w:fldChar w:fldCharType="end"/>
+          </w:r>
+        </w:p>
+      </w:sdtContent>
+    </w:sdt>
     <w:p>
       <w:pPr>
         <w:jc w:val="center"/>
@@ -287,37 +693,73 @@
         </w:rPr>
         <w:br w:type="page"/>
       </w:r>
-      <w:r>
+    </w:p>
+    <w:p>
+      <w:pPr>
+        <w:jc w:val="center"/>
         <w:rPr>
           <w:rFonts w:ascii="Times New Roman" w:hAnsi="Times New Roman" w:cs="Times New Roman"/>
           <w:b/>
           <w:sz w:val="28"/>
           <w:u w:val="single"/>
         </w:rPr>
+      </w:pPr>
+      <w:r>
+        <w:rPr>
+          <w:rFonts w:ascii="Times New Roman" w:hAnsi="Times New Roman" w:cs="Times New Roman"/>
+          <w:b/>
+          <w:sz w:val="28"/>
+          <w:u w:val="single"/>
+        </w:rPr>
         <w:lastRenderedPageBreak/>
         <w:t>LAB 5</w:t>
       </w:r>
     </w:p>
     <w:p>
       <w:pPr>
-        <w:spacing w:line="360" w:lineRule="auto"/>
+        <w:pStyle w:val="Heading1"/>
         <w:jc w:val="center"/>
         <w:rPr>
           <w:rFonts w:ascii="Times New Roman" w:hAnsi="Times New Roman" w:cs="Times New Roman"/>
           <w:b/>
-          <w:sz w:val="28"/>
-          <w:u w:val="single"/>
-        </w:rPr>
-      </w:pPr>
-      <w:r>
-        <w:rPr>
-          <w:rFonts w:ascii="Times New Roman" w:hAnsi="Times New Roman" w:cs="Times New Roman"/>
-          <w:b/>
-          <w:sz w:val="28"/>
-          <w:u w:val="single"/>
+          <w:color w:val="auto"/>
+        </w:rPr>
+      </w:pPr>
+      <w:bookmarkStart w:id="1" w:name="_Toc243584606"/>
+      <w:r>
+        <w:rPr>
+          <w:rFonts w:ascii="Times New Roman" w:hAnsi="Times New Roman" w:cs="Times New Roman"/>
+          <w:b/>
+          <w:color w:val="auto"/>
         </w:rPr>
         <w:t>Using Minimax</w:t>
       </w:r>
+      <w:bookmarkEnd w:id="1"/>
+    </w:p>
+    <w:p>
+      <w:pPr>
+        <w:pStyle w:val="Heading2"/>
+        <w:numPr>
+          <w:ilvl w:val="0"/>
+          <w:numId w:val="7"/>
+        </w:numPr>
+        <w:ind w:left="0"/>
+        <w:rPr>
+          <w:rFonts w:ascii="Times New Roman" w:hAnsi="Times New Roman" w:cs="Times New Roman"/>
+          <w:b/>
+          <w:color w:val="auto"/>
+        </w:rPr>
+      </w:pPr>
+      <w:bookmarkStart w:id="2" w:name="_Toc243584607"/>
+      <w:r>
+        <w:rPr>
+          <w:rFonts w:ascii="Times New Roman" w:hAnsi="Times New Roman" w:cs="Times New Roman"/>
+          <w:b/>
+          <w:color w:val="auto"/>
+        </w:rPr>
+        <w:t>Given data</w:t>
+      </w:r>
+      <w:bookmarkEnd w:id="2"/>
     </w:p>
     <w:p>
       <w:pPr>
@@ -326,28 +768,17 @@
         <w:ind w:left="0"/>
         <w:rPr>
           <w:rFonts w:ascii="Times New Roman" w:hAnsi="Times New Roman" w:cs="Times New Roman"/>
-          <w:b/>
-          <w:sz w:val="28"/>
-          <w:szCs w:val="24"/>
-        </w:rPr>
-      </w:pPr>
-      <w:r>
-        <w:rPr>
-          <w:rFonts w:ascii="Times New Roman" w:hAnsi="Times New Roman" w:cs="Times New Roman"/>
-          <w:b/>
-          <w:sz w:val="28"/>
-          <w:szCs w:val="24"/>
-        </w:rPr>
-        <w:t xml:space="preserve">1. </w:t>
-      </w:r>
-      <w:r>
-        <w:rPr>
-          <w:rFonts w:ascii="Times New Roman" w:hAnsi="Times New Roman" w:cs="Times New Roman"/>
-          <w:b/>
-          <w:sz w:val="28"/>
-          <w:szCs w:val="24"/>
-        </w:rPr>
-        <w:t>Given data</w:t>
+          <w:sz w:val="24"/>
+          <w:szCs w:val="24"/>
+        </w:rPr>
+      </w:pPr>
+      <w:r>
+        <w:rPr>
+          <w:rFonts w:ascii="Times New Roman" w:hAnsi="Times New Roman" w:cs="Times New Roman"/>
+          <w:sz w:val="24"/>
+          <w:szCs w:val="24"/>
+        </w:rPr>
+        <w:t>Value is given in the PDF:</w:t>
       </w:r>
     </w:p>
     <w:p>
@@ -362,13 +793,23 @@
           <w:szCs w:val="24"/>
         </w:rPr>
       </w:pPr>
-      <w:r>
-        <w:rPr>
-          <w:rFonts w:ascii="Times New Roman" w:hAnsi="Times New Roman" w:cs="Times New Roman"/>
-          <w:sz w:val="24"/>
-          <w:szCs w:val="24"/>
-        </w:rPr>
-        <w:t>scores = [3, 5, 2, 9, 0, 7]</w:t>
+      <w:proofErr w:type="gramStart"/>
+      <w:r>
+        <w:rPr>
+          <w:rFonts w:ascii="Times New Roman" w:hAnsi="Times New Roman" w:cs="Times New Roman"/>
+          <w:sz w:val="24"/>
+          <w:szCs w:val="24"/>
+        </w:rPr>
+        <w:t>scores</w:t>
+      </w:r>
+      <w:proofErr w:type="gramEnd"/>
+      <w:r>
+        <w:rPr>
+          <w:rFonts w:ascii="Times New Roman" w:hAnsi="Times New Roman" w:cs="Times New Roman"/>
+          <w:sz w:val="24"/>
+          <w:szCs w:val="24"/>
+        </w:rPr>
+        <w:t xml:space="preserve"> = [3, 5, 2, 9, 0, 7]</w:t>
       </w:r>
     </w:p>
     <w:p>
@@ -388,216 +829,15 @@
           <w:sz w:val="24"/>
           <w:szCs w:val="24"/>
         </w:rPr>
-        <w:t>The program pads the list with zeros to make a complete binary tree.</w:t>
-      </w:r>
-    </w:p>
-    <w:p>
-      <w:pPr>
-        <w:pStyle w:val="ListParagraph"/>
-        <w:spacing w:before="240" w:after="240" w:line="360" w:lineRule="auto"/>
-        <w:ind w:left="0"/>
-        <w:rPr>
-          <w:rFonts w:ascii="Times New Roman" w:hAnsi="Times New Roman" w:cs="Times New Roman"/>
-          <w:sz w:val="24"/>
-          <w:szCs w:val="24"/>
-        </w:rPr>
-      </w:pPr>
-      <w:r>
-        <w:rPr>
-          <w:rFonts w:ascii="Times New Roman" w:hAnsi="Times New Roman" w:cs="Times New Roman"/>
-          <w:sz w:val="24"/>
-          <w:szCs w:val="24"/>
-        </w:rPr>
-        <w:t>- Original leaf scores: [3, 5, 2, 9, 0, 7]</w:t>
-      </w:r>
-    </w:p>
-    <w:p>
-      <w:pPr>
-        <w:pStyle w:val="ListParagraph"/>
-        <w:spacing w:before="240" w:after="240" w:line="360" w:lineRule="auto"/>
-        <w:ind w:left="0"/>
-        <w:rPr>
-          <w:rFonts w:ascii="Times New Roman" w:hAnsi="Times New Roman" w:cs="Times New Roman"/>
-          <w:sz w:val="24"/>
-          <w:szCs w:val="24"/>
-        </w:rPr>
-      </w:pPr>
-      <w:r>
-        <w:rPr>
-          <w:rFonts w:ascii="Times New Roman" w:hAnsi="Times New Roman" w:cs="Times New Roman"/>
-          <w:sz w:val="24"/>
-          <w:szCs w:val="24"/>
-        </w:rPr>
-        <w:t xml:space="preserve">- Tree depth: </w:t>
-      </w:r>
-      <w:r>
-        <w:rPr>
-          <w:rFonts w:ascii="Times New Roman" w:hAnsi="Times New Roman" w:cs="Times New Roman"/>
-          <w:sz w:val="24"/>
-          <w:szCs w:val="24"/>
-        </w:rPr>
-        <w:t>log^2</w:t>
-      </w:r>
-      <w:r>
-        <w:rPr>
-          <w:rFonts w:ascii="Times New Roman" w:hAnsi="Times New Roman" w:cs="Times New Roman"/>
-          <w:sz w:val="24"/>
-          <w:szCs w:val="24"/>
-        </w:rPr>
-        <w:t xml:space="preserve"> 6 = 3</w:t>
-      </w:r>
-    </w:p>
-    <w:p>
-      <w:pPr>
-        <w:pStyle w:val="ListParagraph"/>
-        <w:spacing w:before="240" w:after="240" w:line="360" w:lineRule="auto"/>
-        <w:ind w:left="0"/>
-        <w:rPr>
-          <w:rFonts w:ascii="Times New Roman" w:hAnsi="Times New Roman" w:cs="Times New Roman"/>
-          <w:sz w:val="24"/>
-          <w:szCs w:val="24"/>
-        </w:rPr>
-      </w:pPr>
-      <w:r>
-        <w:rPr>
-          <w:rFonts w:ascii="Times New Roman" w:hAnsi="Times New Roman" w:cs="Times New Roman"/>
-          <w:sz w:val="24"/>
-          <w:szCs w:val="24"/>
-        </w:rPr>
-        <w:t>- Padded leaf scores: [3, 5, 2, 9, 0, 7, 0, 0]</w:t>
-      </w:r>
-    </w:p>
-    <w:p>
-      <w:pPr>
-        <w:pStyle w:val="ListParagraph"/>
-        <w:spacing w:before="240" w:after="240" w:line="360" w:lineRule="auto"/>
-        <w:ind w:left="0"/>
-        <w:rPr>
-          <w:rFonts w:ascii="Times New Roman" w:hAnsi="Times New Roman" w:cs="Times New Roman"/>
-          <w:sz w:val="24"/>
-          <w:szCs w:val="24"/>
-        </w:rPr>
-      </w:pPr>
-      <w:r>
-        <w:rPr>
-          <w:rFonts w:ascii="Times New Roman" w:hAnsi="Times New Roman" w:cs="Times New Roman"/>
-          <w:sz w:val="24"/>
-          <w:szCs w:val="24"/>
-        </w:rPr>
-        <w:t>Minimax rule:</w:t>
-      </w:r>
-    </w:p>
-    <w:p>
-      <w:pPr>
-        <w:pStyle w:val="ListParagraph"/>
-        <w:spacing w:before="240" w:after="240" w:line="360" w:lineRule="auto"/>
-        <w:ind w:left="0"/>
-        <w:rPr>
-          <w:rFonts w:ascii="Times New Roman" w:hAnsi="Times New Roman" w:cs="Times New Roman"/>
-          <w:sz w:val="24"/>
-          <w:szCs w:val="24"/>
-        </w:rPr>
-      </w:pPr>
-      <w:r>
-        <w:rPr>
-          <w:rFonts w:ascii="Times New Roman" w:hAnsi="Times New Roman" w:cs="Times New Roman"/>
-          <w:sz w:val="24"/>
-          <w:szCs w:val="24"/>
-        </w:rPr>
-        <w:t>MAX picks out the biggest number.</w:t>
-      </w:r>
-    </w:p>
-    <w:p>
-      <w:pPr>
-        <w:pStyle w:val="ListParagraph"/>
-        <w:spacing w:before="240" w:after="240" w:line="360" w:lineRule="auto"/>
-        <w:ind w:left="0"/>
-        <w:rPr>
-          <w:rFonts w:ascii="Times New Roman" w:hAnsi="Times New Roman" w:cs="Times New Roman"/>
-          <w:sz w:val="24"/>
-          <w:szCs w:val="24"/>
-        </w:rPr>
-      </w:pPr>
-      <w:r>
-        <w:rPr>
-          <w:rFonts w:ascii="Times New Roman" w:hAnsi="Times New Roman" w:cs="Times New Roman"/>
-          <w:sz w:val="24"/>
-          <w:szCs w:val="24"/>
-        </w:rPr>
-        <w:t>- MIN returns the smallest value.</w:t>
-      </w:r>
-    </w:p>
-    <w:p>
-      <w:pPr>
-        <w:pStyle w:val="ListParagraph"/>
-        <w:spacing w:before="240" w:after="240" w:line="360" w:lineRule="auto"/>
-        <w:ind w:left="0"/>
-        <w:rPr>
-          <w:rFonts w:ascii="Times New Roman" w:hAnsi="Times New Roman" w:cs="Times New Roman"/>
-          <w:sz w:val="24"/>
-          <w:szCs w:val="24"/>
-        </w:rPr>
-      </w:pPr>
-      <w:r>
-        <w:rPr>
-          <w:rFonts w:ascii="Times New Roman" w:hAnsi="Times New Roman" w:cs="Times New Roman"/>
-          <w:sz w:val="24"/>
-          <w:szCs w:val="24"/>
-        </w:rPr>
-        <w:t>The values are computed starting from the leaves upwards to the root.</w:t>
-      </w:r>
-    </w:p>
-    <w:p>
-      <w:pPr>
-        <w:pStyle w:val="ListParagraph"/>
-        <w:spacing w:before="240" w:after="240" w:line="360" w:lineRule="auto"/>
-        <w:ind w:left="0"/>
-        <w:rPr>
-          <w:rFonts w:ascii="Times New Roman" w:hAnsi="Times New Roman" w:cs="Times New Roman"/>
-          <w:b/>
-          <w:sz w:val="28"/>
-          <w:szCs w:val="24"/>
-        </w:rPr>
-      </w:pPr>
-      <w:r>
-        <w:rPr>
-          <w:rFonts w:ascii="Times New Roman" w:hAnsi="Times New Roman" w:cs="Times New Roman"/>
-          <w:b/>
-          <w:sz w:val="28"/>
-          <w:szCs w:val="24"/>
-        </w:rPr>
-        <w:t xml:space="preserve">2. </w:t>
-      </w:r>
-      <w:r>
-        <w:rPr>
-          <w:rFonts w:ascii="Times New Roman" w:hAnsi="Times New Roman" w:cs="Times New Roman"/>
-          <w:b/>
-          <w:sz w:val="28"/>
-          <w:szCs w:val="24"/>
-        </w:rPr>
-        <w:t>Calculate values from bottom to top</w:t>
-      </w:r>
-    </w:p>
-    <w:p>
-      <w:pPr>
-        <w:pStyle w:val="ListParagraph"/>
-        <w:spacing w:before="240" w:after="240" w:line="360" w:lineRule="auto"/>
-        <w:ind w:left="0"/>
-        <w:rPr>
-          <w:rFonts w:ascii="Times New Roman" w:hAnsi="Times New Roman" w:cs="Times New Roman"/>
-          <w:b/>
-          <w:sz w:val="24"/>
-          <w:szCs w:val="24"/>
-        </w:rPr>
-      </w:pPr>
-      <w:r>
-        <w:rPr>
-          <w:rFonts w:ascii="Times New Roman" w:hAnsi="Times New Roman" w:cs="Times New Roman"/>
-          <w:b/>
-          <w:sz w:val="24"/>
-          <w:szCs w:val="24"/>
-        </w:rPr>
-        <w:t>Level 1</w:t>
+        <w:t xml:space="preserve">We </w:t>
+      </w:r>
+      <w:r>
+        <w:rPr>
+          <w:rFonts w:ascii="Times New Roman" w:hAnsi="Times New Roman" w:cs="Times New Roman"/>
+          <w:sz w:val="24"/>
+          <w:szCs w:val="24"/>
+        </w:rPr>
+        <w:t>want a complete tree so we will add two 0 at the end:</w:t>
       </w:r>
     </w:p>
     <w:p>
@@ -608,28 +848,17 @@
         <w:jc w:val="center"/>
         <w:rPr>
           <w:rFonts w:ascii="Times New Roman" w:hAnsi="Times New Roman" w:cs="Times New Roman"/>
-          <w:b/>
-          <w:sz w:val="24"/>
-          <w:szCs w:val="24"/>
-        </w:rPr>
-      </w:pPr>
-      <w:r>
-        <w:rPr>
-          <w:rFonts w:ascii="Times New Roman" w:hAnsi="Times New Roman" w:cs="Times New Roman"/>
-          <w:b/>
-          <w:sz w:val="24"/>
-          <w:szCs w:val="24"/>
-        </w:rPr>
-        <w:t>max(3,5)</w:t>
-      </w:r>
-      <w:r>
-        <w:rPr>
-          <w:rFonts w:ascii="Times New Roman" w:hAnsi="Times New Roman" w:cs="Times New Roman"/>
-          <w:b/>
-          <w:sz w:val="24"/>
-          <w:szCs w:val="24"/>
-        </w:rPr>
-        <w:t>=5</w:t>
+          <w:sz w:val="24"/>
+          <w:szCs w:val="24"/>
+        </w:rPr>
+      </w:pPr>
+      <w:r>
+        <w:rPr>
+          <w:rFonts w:ascii="Times New Roman" w:hAnsi="Times New Roman" w:cs="Times New Roman"/>
+          <w:sz w:val="24"/>
+          <w:szCs w:val="24"/>
+        </w:rPr>
+        <w:t>[3, 5, 2, 9, 0, 7, 0, 0]</w:t>
       </w:r>
     </w:p>
     <w:p>
@@ -640,28 +869,307 @@
         <w:jc w:val="center"/>
         <w:rPr>
           <w:rFonts w:ascii="Times New Roman" w:hAnsi="Times New Roman" w:cs="Times New Roman"/>
-          <w:b/>
-          <w:sz w:val="24"/>
-          <w:szCs w:val="24"/>
-        </w:rPr>
-      </w:pPr>
-      <w:r>
-        <w:rPr>
-          <w:rFonts w:ascii="Times New Roman" w:hAnsi="Times New Roman" w:cs="Times New Roman"/>
-          <w:b/>
-          <w:sz w:val="24"/>
-          <w:szCs w:val="24"/>
-        </w:rPr>
-        <w:t>max(2,9)</w:t>
-      </w:r>
-      <w:r>
-        <w:rPr>
-          <w:rFonts w:ascii="Times New Roman" w:hAnsi="Times New Roman" w:cs="Times New Roman"/>
-          <w:b/>
-          <w:sz w:val="24"/>
-          <w:szCs w:val="24"/>
-        </w:rPr>
-        <w:t>=9</w:t>
+          <w:sz w:val="24"/>
+          <w:szCs w:val="24"/>
+        </w:rPr>
+      </w:pPr>
+      <w:r>
+        <w:rPr>
+          <w:rFonts w:ascii="Times New Roman" w:hAnsi="Times New Roman" w:cs="Times New Roman"/>
+          <w:sz w:val="24"/>
+          <w:szCs w:val="24"/>
+        </w:rPr>
+        <w:t xml:space="preserve">We do this to make the Level 3 </w:t>
+      </w:r>
+      <w:proofErr w:type="gramStart"/>
+      <w:r>
+        <w:rPr>
+          <w:rFonts w:ascii="Times New Roman" w:hAnsi="Times New Roman" w:cs="Times New Roman"/>
+          <w:sz w:val="24"/>
+          <w:szCs w:val="24"/>
+        </w:rPr>
+        <w:t>more clear</w:t>
+      </w:r>
+      <w:proofErr w:type="gramEnd"/>
+      <w:r>
+        <w:rPr>
+          <w:rFonts w:ascii="Times New Roman" w:hAnsi="Times New Roman" w:cs="Times New Roman"/>
+          <w:sz w:val="24"/>
+          <w:szCs w:val="24"/>
+        </w:rPr>
+        <w:t xml:space="preserve"> as stated in the diagram.</w:t>
+      </w:r>
+    </w:p>
+    <w:p>
+      <w:pPr>
+        <w:pStyle w:val="ListParagraph"/>
+        <w:spacing w:before="240" w:after="240" w:line="360" w:lineRule="auto"/>
+        <w:ind w:left="0"/>
+        <w:rPr>
+          <w:rFonts w:ascii="Times New Roman" w:hAnsi="Times New Roman" w:cs="Times New Roman"/>
+          <w:sz w:val="24"/>
+          <w:szCs w:val="24"/>
+        </w:rPr>
+      </w:pPr>
+      <w:r>
+        <w:rPr>
+          <w:rFonts w:ascii="Times New Roman" w:hAnsi="Times New Roman" w:cs="Times New Roman"/>
+          <w:sz w:val="24"/>
+          <w:szCs w:val="24"/>
+        </w:rPr>
+        <w:t>Minimax rule:</w:t>
+      </w:r>
+    </w:p>
+    <w:p>
+      <w:pPr>
+        <w:pStyle w:val="ListParagraph"/>
+        <w:spacing w:before="240" w:after="240" w:line="360" w:lineRule="auto"/>
+        <w:ind w:left="0"/>
+        <w:rPr>
+          <w:rFonts w:ascii="Times New Roman" w:hAnsi="Times New Roman" w:cs="Times New Roman"/>
+          <w:sz w:val="24"/>
+          <w:szCs w:val="24"/>
+        </w:rPr>
+      </w:pPr>
+      <w:r>
+        <w:rPr>
+          <w:rFonts w:ascii="Times New Roman" w:hAnsi="Times New Roman" w:cs="Times New Roman"/>
+          <w:sz w:val="24"/>
+          <w:szCs w:val="24"/>
+        </w:rPr>
+        <w:t>MAX picks out the biggest number.</w:t>
+      </w:r>
+    </w:p>
+    <w:p>
+      <w:pPr>
+        <w:pStyle w:val="ListParagraph"/>
+        <w:spacing w:before="240" w:after="240" w:line="360" w:lineRule="auto"/>
+        <w:ind w:left="0"/>
+        <w:rPr>
+          <w:rFonts w:ascii="Times New Roman" w:hAnsi="Times New Roman" w:cs="Times New Roman"/>
+          <w:sz w:val="24"/>
+          <w:szCs w:val="24"/>
+        </w:rPr>
+      </w:pPr>
+      <w:r>
+        <w:rPr>
+          <w:rFonts w:ascii="Times New Roman" w:hAnsi="Times New Roman" w:cs="Times New Roman"/>
+          <w:sz w:val="24"/>
+          <w:szCs w:val="24"/>
+        </w:rPr>
+        <w:t>MIN returns the smallest value.</w:t>
+      </w:r>
+    </w:p>
+    <w:p>
+      <w:pPr>
+        <w:pStyle w:val="Heading2"/>
+        <w:numPr>
+          <w:ilvl w:val="0"/>
+          <w:numId w:val="7"/>
+        </w:numPr>
+        <w:ind w:left="0"/>
+        <w:rPr>
+          <w:rFonts w:ascii="Times New Roman" w:hAnsi="Times New Roman" w:cs="Times New Roman"/>
+          <w:b/>
+          <w:color w:val="auto"/>
+        </w:rPr>
+      </w:pPr>
+      <w:bookmarkStart w:id="3" w:name="_Toc243584608"/>
+      <w:r>
+        <w:rPr>
+          <w:rFonts w:ascii="Times New Roman" w:hAnsi="Times New Roman" w:cs="Times New Roman"/>
+          <w:b/>
+          <w:color w:val="auto"/>
+        </w:rPr>
+        <w:t>Diagram</w:t>
+      </w:r>
+      <w:bookmarkEnd w:id="3"/>
+    </w:p>
+    <w:p>
+      <w:pPr>
+        <w:pStyle w:val="ListParagraph"/>
+        <w:spacing w:before="240" w:after="240" w:line="360" w:lineRule="auto"/>
+        <w:jc w:val="center"/>
+        <w:rPr>
+          <w:rFonts w:ascii="Times New Roman" w:hAnsi="Times New Roman" w:cs="Times New Roman"/>
+          <w:b/>
+          <w:sz w:val="28"/>
+          <w:szCs w:val="24"/>
+        </w:rPr>
+      </w:pPr>
+      <w:r>
+        <w:rPr>
+          <w:rFonts w:ascii="Times New Roman" w:hAnsi="Times New Roman" w:cs="Times New Roman"/>
+          <w:b/>
+          <w:noProof/>
+          <w:sz w:val="28"/>
+          <w:szCs w:val="24"/>
+        </w:rPr>
+        <w:drawing>
+          <wp:inline distT="0" distB="0" distL="0" distR="0">
+            <wp:extent cx="4080086" cy="3812875"/>
+            <wp:effectExtent l="0" t="0" r="0" b="0"/>
+            <wp:docPr id="2" name="Picture 2"/>
+            <wp:cNvGraphicFramePr>
+              <a:graphicFrameLocks xmlns:a="http://schemas.openxmlformats.org/drawingml/2006/main" noChangeAspect="1"/>
+            </wp:cNvGraphicFramePr>
+            <a:graphic xmlns:a="http://schemas.openxmlformats.org/drawingml/2006/main">
+              <a:graphicData uri="http://schemas.openxmlformats.org/drawingml/2006/picture">
+                <pic:pic xmlns:pic="http://schemas.openxmlformats.org/drawingml/2006/picture">
+                  <pic:nvPicPr>
+                    <pic:cNvPr id="2" name="WhatsApp Image 2026-10-22 at 5.54.09 PM.jpeg"/>
+                    <pic:cNvPicPr/>
+                  </pic:nvPicPr>
+                  <pic:blipFill>
+                    <a:blip r:embed="rId9" cstate="print">
+                      <a:extLst>
+                        <a:ext uri="{28A0092B-C50C-407E-A947-70E740481C1C}">
+                          <a14:useLocalDpi xmlns:a14="http://schemas.microsoft.com/office/drawing/2010/main" val="0"/>
+                        </a:ext>
+                      </a:extLst>
+                    </a:blip>
+                    <a:stretch>
+                      <a:fillRect/>
+                    </a:stretch>
+                  </pic:blipFill>
+                  <pic:spPr>
+                    <a:xfrm>
+                      <a:off x="0" y="0"/>
+                      <a:ext cx="4096405" cy="3828125"/>
+                    </a:xfrm>
+                    <a:prstGeom prst="rect">
+                      <a:avLst/>
+                    </a:prstGeom>
+                  </pic:spPr>
+                </pic:pic>
+              </a:graphicData>
+            </a:graphic>
+          </wp:inline>
+        </w:drawing>
+      </w:r>
+    </w:p>
+    <w:p>
+      <w:pPr>
+        <w:pStyle w:val="ListParagraph"/>
+        <w:spacing w:before="240" w:after="240" w:line="360" w:lineRule="auto"/>
+        <w:ind w:left="0"/>
+        <w:rPr>
+          <w:rFonts w:ascii="Times New Roman" w:hAnsi="Times New Roman" w:cs="Times New Roman"/>
+          <w:b/>
+          <w:sz w:val="28"/>
+          <w:szCs w:val="24"/>
+        </w:rPr>
+      </w:pPr>
+    </w:p>
+    <w:p>
+      <w:pPr>
+        <w:pStyle w:val="ListParagraph"/>
+        <w:spacing w:before="240" w:after="240" w:line="360" w:lineRule="auto"/>
+        <w:ind w:left="0"/>
+        <w:rPr>
+          <w:rFonts w:ascii="Times New Roman" w:hAnsi="Times New Roman" w:cs="Times New Roman"/>
+          <w:b/>
+          <w:sz w:val="28"/>
+          <w:szCs w:val="24"/>
+        </w:rPr>
+      </w:pPr>
+    </w:p>
+    <w:p>
+      <w:pPr>
+        <w:pStyle w:val="Heading2"/>
+        <w:numPr>
+          <w:ilvl w:val="0"/>
+          <w:numId w:val="7"/>
+        </w:numPr>
+        <w:ind w:left="0"/>
+        <w:rPr>
+          <w:rFonts w:ascii="Times New Roman" w:hAnsi="Times New Roman" w:cs="Times New Roman"/>
+          <w:b/>
+          <w:color w:val="auto"/>
+        </w:rPr>
+      </w:pPr>
+      <w:bookmarkStart w:id="4" w:name="_Toc243584609"/>
+      <w:r>
+        <w:rPr>
+          <w:rFonts w:ascii="Times New Roman" w:hAnsi="Times New Roman" w:cs="Times New Roman"/>
+          <w:b/>
+          <w:color w:val="auto"/>
+        </w:rPr>
+        <w:lastRenderedPageBreak/>
+        <w:t>Calculation</w:t>
+      </w:r>
+      <w:bookmarkEnd w:id="4"/>
+    </w:p>
+    <w:p>
+      <w:pPr>
+        <w:pStyle w:val="ListParagraph"/>
+        <w:spacing w:before="240" w:after="240" w:line="360" w:lineRule="auto"/>
+        <w:ind w:left="0"/>
+        <w:rPr>
+          <w:rFonts w:ascii="Times New Roman" w:hAnsi="Times New Roman" w:cs="Times New Roman"/>
+          <w:b/>
+          <w:sz w:val="24"/>
+          <w:szCs w:val="24"/>
+        </w:rPr>
+      </w:pPr>
+      <w:r>
+        <w:rPr>
+          <w:rFonts w:ascii="Times New Roman" w:hAnsi="Times New Roman" w:cs="Times New Roman"/>
+          <w:b/>
+          <w:sz w:val="24"/>
+          <w:szCs w:val="24"/>
+        </w:rPr>
+        <w:t>Level 1</w:t>
+      </w:r>
+    </w:p>
+    <w:p>
+      <w:pPr>
+        <w:pStyle w:val="ListParagraph"/>
+        <w:spacing w:before="240" w:after="240" w:line="360" w:lineRule="auto"/>
+        <w:ind w:left="0"/>
+        <w:rPr>
+          <w:rFonts w:ascii="Times New Roman" w:hAnsi="Times New Roman" w:cs="Times New Roman"/>
+          <w:sz w:val="24"/>
+          <w:szCs w:val="24"/>
+        </w:rPr>
+      </w:pPr>
+      <w:r>
+        <w:rPr>
+          <w:rFonts w:ascii="Times New Roman" w:hAnsi="Times New Roman" w:cs="Times New Roman"/>
+          <w:sz w:val="24"/>
+          <w:szCs w:val="24"/>
+        </w:rPr>
+        <w:t>As</w:t>
+      </w:r>
+      <w:r>
+        <w:rPr>
+          <w:rFonts w:ascii="Times New Roman" w:hAnsi="Times New Roman" w:cs="Times New Roman"/>
+          <w:sz w:val="24"/>
+          <w:szCs w:val="24"/>
+        </w:rPr>
+        <w:t xml:space="preserve"> stated in diagram Max chooses the largest value from each pair.</w:t>
+      </w:r>
+    </w:p>
+    <w:p>
+      <w:pPr>
+        <w:pStyle w:val="ListParagraph"/>
+        <w:spacing w:before="240" w:after="240" w:line="360" w:lineRule="auto"/>
+        <w:ind w:left="0"/>
+        <w:rPr>
+          <w:rFonts w:ascii="Times New Roman" w:hAnsi="Times New Roman" w:cs="Times New Roman"/>
+          <w:b/>
+          <w:sz w:val="24"/>
+          <w:szCs w:val="24"/>
+        </w:rPr>
+      </w:pPr>
+      <w:r>
+        <w:rPr>
+          <w:rFonts w:ascii="Times New Roman" w:hAnsi="Times New Roman" w:cs="Times New Roman"/>
+          <w:b/>
+          <w:sz w:val="24"/>
+          <w:szCs w:val="24"/>
+        </w:rPr>
+        <w:t>Hence;</w:t>
       </w:r>
     </w:p>
     <w:p>
@@ -677,32 +1185,34 @@
           <w:szCs w:val="24"/>
         </w:rPr>
       </w:pPr>
-      <w:r>
-        <w:rPr>
-          <w:rFonts w:ascii="Times New Roman" w:hAnsi="Times New Roman" w:cs="Times New Roman"/>
-          <w:b/>
-          <w:sz w:val="24"/>
-          <w:szCs w:val="24"/>
-        </w:rPr>
-        <w:t>max(0,7)</w:t>
-      </w:r>
-      <w:r>
-        <w:rPr>
-          <w:rFonts w:ascii="Times New Roman" w:hAnsi="Times New Roman" w:cs="Times New Roman"/>
-          <w:b/>
-          <w:sz w:val="24"/>
-          <w:szCs w:val="24"/>
-        </w:rPr>
-        <w:t>=7</w:t>
-      </w:r>
-      <w:r>
-        <w:rPr>
-          <w:rFonts w:ascii="Times New Roman" w:hAnsi="Times New Roman" w:cs="Times New Roman"/>
-          <w:b/>
-          <w:sz w:val="24"/>
-          <w:szCs w:val="24"/>
-        </w:rPr>
-        <w:t xml:space="preserve"> </w:t>
+      <w:proofErr w:type="gramStart"/>
+      <w:r>
+        <w:rPr>
+          <w:rFonts w:ascii="Times New Roman" w:hAnsi="Times New Roman" w:cs="Times New Roman"/>
+          <w:b/>
+          <w:sz w:val="24"/>
+          <w:szCs w:val="24"/>
+        </w:rPr>
+        <w:t>max(</w:t>
+      </w:r>
+      <w:proofErr w:type="gramEnd"/>
+      <w:r>
+        <w:rPr>
+          <w:rFonts w:ascii="Times New Roman" w:hAnsi="Times New Roman" w:cs="Times New Roman"/>
+          <w:b/>
+          <w:sz w:val="24"/>
+          <w:szCs w:val="24"/>
+        </w:rPr>
+        <w:t>3,5)</w:t>
+      </w:r>
+      <w:r>
+        <w:rPr>
+          <w:rFonts w:ascii="Times New Roman" w:hAnsi="Times New Roman" w:cs="Times New Roman"/>
+          <w:b/>
+          <w:sz w:val="24"/>
+          <w:szCs w:val="24"/>
+        </w:rPr>
+        <w:t>=5</w:t>
       </w:r>
     </w:p>
     <w:p>
@@ -718,65 +1228,34 @@
           <w:szCs w:val="24"/>
         </w:rPr>
       </w:pPr>
-      <w:r>
-        <w:rPr>
-          <w:rFonts w:ascii="Times New Roman" w:hAnsi="Times New Roman" w:cs="Times New Roman"/>
-          <w:b/>
-          <w:sz w:val="24"/>
-          <w:szCs w:val="24"/>
-        </w:rPr>
-        <w:t>max(0,0)</w:t>
-      </w:r>
-      <w:r>
-        <w:rPr>
-          <w:rFonts w:ascii="Times New Roman" w:hAnsi="Times New Roman" w:cs="Times New Roman"/>
-          <w:b/>
-          <w:sz w:val="24"/>
-          <w:szCs w:val="24"/>
-        </w:rPr>
-        <w:t xml:space="preserve">=0 </w:t>
-      </w:r>
-    </w:p>
-    <w:p>
-      <w:pPr>
-        <w:pStyle w:val="ListParagraph"/>
-        <w:spacing w:before="240" w:after="240" w:line="360" w:lineRule="auto"/>
-        <w:ind w:left="0"/>
-        <w:rPr>
-          <w:rFonts w:ascii="Times New Roman" w:hAnsi="Times New Roman" w:cs="Times New Roman"/>
-          <w:sz w:val="24"/>
-          <w:szCs w:val="24"/>
-        </w:rPr>
-      </w:pPr>
-      <w:r>
-        <w:rPr>
-          <w:rFonts w:ascii="Times New Roman" w:hAnsi="Times New Roman" w:cs="Times New Roman"/>
-          <w:sz w:val="24"/>
-          <w:szCs w:val="24"/>
-        </w:rPr>
-        <w:t>The MAX-level values are 5, 9, 7, 0.</w:t>
-      </w:r>
-    </w:p>
-    <w:p>
-      <w:pPr>
-        <w:pStyle w:val="ListParagraph"/>
-        <w:spacing w:before="240" w:after="240" w:line="360" w:lineRule="auto"/>
-        <w:ind w:left="0"/>
-        <w:rPr>
-          <w:rFonts w:ascii="Times New Roman" w:hAnsi="Times New Roman" w:cs="Times New Roman"/>
-          <w:b/>
-          <w:sz w:val="24"/>
-          <w:szCs w:val="24"/>
-        </w:rPr>
-      </w:pPr>
-      <w:r>
-        <w:rPr>
-          <w:rFonts w:ascii="Times New Roman" w:hAnsi="Times New Roman" w:cs="Times New Roman"/>
-          <w:b/>
-          <w:sz w:val="24"/>
-          <w:szCs w:val="24"/>
-        </w:rPr>
-        <w:t xml:space="preserve">Level 2 </w:t>
+      <w:proofErr w:type="gramStart"/>
+      <w:r>
+        <w:rPr>
+          <w:rFonts w:ascii="Times New Roman" w:hAnsi="Times New Roman" w:cs="Times New Roman"/>
+          <w:b/>
+          <w:sz w:val="24"/>
+          <w:szCs w:val="24"/>
+        </w:rPr>
+        <w:t>max(</w:t>
+      </w:r>
+      <w:proofErr w:type="gramEnd"/>
+      <w:r>
+        <w:rPr>
+          <w:rFonts w:ascii="Times New Roman" w:hAnsi="Times New Roman" w:cs="Times New Roman"/>
+          <w:b/>
+          <w:sz w:val="24"/>
+          <w:szCs w:val="24"/>
+        </w:rPr>
+        <w:t>2,9)</w:t>
+      </w:r>
+      <w:r>
+        <w:rPr>
+          <w:rFonts w:ascii="Times New Roman" w:hAnsi="Times New Roman" w:cs="Times New Roman"/>
+          <w:b/>
+          <w:sz w:val="24"/>
+          <w:szCs w:val="24"/>
+        </w:rPr>
+        <w:t>=9</w:t>
       </w:r>
     </w:p>
     <w:p>
@@ -787,17 +1266,48 @@
         <w:jc w:val="center"/>
         <w:rPr>
           <w:rFonts w:ascii="Times New Roman" w:hAnsi="Times New Roman" w:cs="Times New Roman"/>
-          <w:sz w:val="24"/>
-          <w:szCs w:val="24"/>
-        </w:rPr>
-      </w:pPr>
-      <w:r>
-        <w:rPr>
-          <w:rFonts w:ascii="Times New Roman" w:hAnsi="Times New Roman" w:cs="Times New Roman"/>
-          <w:sz w:val="24"/>
-          <w:szCs w:val="24"/>
-        </w:rPr>
-        <w:t>min(5,9)=5</w:t>
+          <w:b/>
+          <w:sz w:val="24"/>
+          <w:szCs w:val="24"/>
+        </w:rPr>
+      </w:pPr>
+      <w:proofErr w:type="gramStart"/>
+      <w:r>
+        <w:rPr>
+          <w:rFonts w:ascii="Times New Roman" w:hAnsi="Times New Roman" w:cs="Times New Roman"/>
+          <w:b/>
+          <w:sz w:val="24"/>
+          <w:szCs w:val="24"/>
+        </w:rPr>
+        <w:t>max(</w:t>
+      </w:r>
+      <w:proofErr w:type="gramEnd"/>
+      <w:r>
+        <w:rPr>
+          <w:rFonts w:ascii="Times New Roman" w:hAnsi="Times New Roman" w:cs="Times New Roman"/>
+          <w:b/>
+          <w:sz w:val="24"/>
+          <w:szCs w:val="24"/>
+        </w:rPr>
+        <w:t>0,7)</w:t>
+      </w:r>
+      <w:r>
+        <w:rPr>
+          <w:rFonts w:ascii="Times New Roman" w:hAnsi="Times New Roman" w:cs="Times New Roman"/>
+          <w:b/>
+          <w:sz w:val="24"/>
+          <w:szCs w:val="24"/>
+        </w:rPr>
+        <w:t>=7</w:t>
+      </w:r>
+      <w:r>
+        <w:rPr>
+          <w:rFonts w:ascii="Times New Roman" w:hAnsi="Times New Roman" w:cs="Times New Roman"/>
+          <w:b/>
+          <w:sz w:val="24"/>
+          <w:szCs w:val="24"/>
+        </w:rPr>
+        <w:t xml:space="preserve"> </w:t>
       </w:r>
     </w:p>
     <w:p>
@@ -813,21 +1323,190 @@
           <w:szCs w:val="24"/>
         </w:rPr>
       </w:pPr>
-      <w:r>
-        <w:rPr>
-          <w:rFonts w:ascii="Times New Roman" w:hAnsi="Times New Roman" w:cs="Times New Roman"/>
-          <w:sz w:val="24"/>
-          <w:szCs w:val="24"/>
-        </w:rPr>
-        <w:t>min(7,0)</w:t>
-      </w:r>
-      <w:r>
-        <w:rPr>
-          <w:rFonts w:ascii="Times New Roman" w:hAnsi="Times New Roman" w:cs="Times New Roman"/>
+      <w:proofErr w:type="gramStart"/>
+      <w:r>
+        <w:rPr>
+          <w:rFonts w:ascii="Times New Roman" w:hAnsi="Times New Roman" w:cs="Times New Roman"/>
+          <w:b/>
+          <w:sz w:val="24"/>
+          <w:szCs w:val="24"/>
+        </w:rPr>
+        <w:t>max(</w:t>
+      </w:r>
+      <w:proofErr w:type="gramEnd"/>
+      <w:r>
+        <w:rPr>
+          <w:rFonts w:ascii="Times New Roman" w:hAnsi="Times New Roman" w:cs="Times New Roman"/>
+          <w:b/>
+          <w:sz w:val="24"/>
+          <w:szCs w:val="24"/>
+        </w:rPr>
+        <w:t>0,0)</w:t>
+      </w:r>
+      <w:r>
+        <w:rPr>
+          <w:rFonts w:ascii="Times New Roman" w:hAnsi="Times New Roman" w:cs="Times New Roman"/>
+          <w:b/>
           <w:sz w:val="24"/>
           <w:szCs w:val="24"/>
         </w:rPr>
         <w:t xml:space="preserve">=0 </w:t>
+      </w:r>
+    </w:p>
+    <w:p>
+      <w:pPr>
+        <w:pStyle w:val="ListParagraph"/>
+        <w:spacing w:before="240" w:after="240" w:line="360" w:lineRule="auto"/>
+        <w:ind w:left="0"/>
+        <w:rPr>
+          <w:rFonts w:ascii="Times New Roman" w:hAnsi="Times New Roman" w:cs="Times New Roman"/>
+          <w:b/>
+          <w:sz w:val="24"/>
+          <w:szCs w:val="24"/>
+        </w:rPr>
+      </w:pPr>
+      <w:r>
+        <w:rPr>
+          <w:rFonts w:ascii="Times New Roman" w:hAnsi="Times New Roman" w:cs="Times New Roman"/>
+          <w:b/>
+          <w:sz w:val="24"/>
+          <w:szCs w:val="24"/>
+        </w:rPr>
+        <w:t xml:space="preserve">Level 2 </w:t>
+      </w:r>
+    </w:p>
+    <w:p>
+      <w:pPr>
+        <w:pStyle w:val="ListParagraph"/>
+        <w:spacing w:before="240" w:after="240" w:line="360" w:lineRule="auto"/>
+        <w:ind w:left="0"/>
+        <w:rPr>
+          <w:rFonts w:ascii="Times New Roman" w:hAnsi="Times New Roman" w:cs="Times New Roman"/>
+          <w:sz w:val="24"/>
+          <w:szCs w:val="24"/>
+        </w:rPr>
+      </w:pPr>
+      <w:r>
+        <w:rPr>
+          <w:rFonts w:ascii="Times New Roman" w:hAnsi="Times New Roman" w:cs="Times New Roman"/>
+          <w:sz w:val="24"/>
+          <w:szCs w:val="24"/>
+        </w:rPr>
+        <w:t>As</w:t>
+      </w:r>
+      <w:r>
+        <w:rPr>
+          <w:rFonts w:ascii="Times New Roman" w:hAnsi="Times New Roman" w:cs="Times New Roman"/>
+          <w:sz w:val="24"/>
+          <w:szCs w:val="24"/>
+        </w:rPr>
+        <w:t xml:space="preserve"> stated in diagram </w:t>
+      </w:r>
+      <w:r>
+        <w:rPr>
+          <w:rFonts w:ascii="Times New Roman" w:hAnsi="Times New Roman" w:cs="Times New Roman"/>
+          <w:sz w:val="24"/>
+          <w:szCs w:val="24"/>
+        </w:rPr>
+        <w:t>Min</w:t>
+      </w:r>
+      <w:r>
+        <w:rPr>
+          <w:rFonts w:ascii="Times New Roman" w:hAnsi="Times New Roman" w:cs="Times New Roman"/>
+          <w:sz w:val="24"/>
+          <w:szCs w:val="24"/>
+        </w:rPr>
+        <w:t xml:space="preserve"> chooses the largest value from each pair.</w:t>
+      </w:r>
+    </w:p>
+    <w:p>
+      <w:pPr>
+        <w:pStyle w:val="ListParagraph"/>
+        <w:spacing w:before="240" w:after="240" w:line="360" w:lineRule="auto"/>
+        <w:ind w:left="0"/>
+        <w:rPr>
+          <w:rFonts w:ascii="Times New Roman" w:hAnsi="Times New Roman" w:cs="Times New Roman"/>
+          <w:b/>
+          <w:sz w:val="24"/>
+          <w:szCs w:val="24"/>
+        </w:rPr>
+      </w:pPr>
+      <w:r>
+        <w:rPr>
+          <w:rFonts w:ascii="Times New Roman" w:hAnsi="Times New Roman" w:cs="Times New Roman"/>
+          <w:b/>
+          <w:sz w:val="24"/>
+          <w:szCs w:val="24"/>
+        </w:rPr>
+        <w:t>Hence;</w:t>
+      </w:r>
+    </w:p>
+    <w:p>
+      <w:pPr>
+        <w:pStyle w:val="ListParagraph"/>
+        <w:spacing w:before="240" w:after="240" w:line="360" w:lineRule="auto"/>
+        <w:ind w:left="0"/>
+        <w:jc w:val="center"/>
+        <w:rPr>
+          <w:rFonts w:ascii="Times New Roman" w:hAnsi="Times New Roman" w:cs="Times New Roman"/>
+          <w:b/>
+          <w:sz w:val="24"/>
+          <w:szCs w:val="24"/>
+        </w:rPr>
+      </w:pPr>
+      <w:proofErr w:type="gramStart"/>
+      <w:r>
+        <w:rPr>
+          <w:rFonts w:ascii="Times New Roman" w:hAnsi="Times New Roman" w:cs="Times New Roman"/>
+          <w:b/>
+          <w:sz w:val="24"/>
+          <w:szCs w:val="24"/>
+        </w:rPr>
+        <w:t>min(</w:t>
+      </w:r>
+      <w:proofErr w:type="gramEnd"/>
+      <w:r>
+        <w:rPr>
+          <w:rFonts w:ascii="Times New Roman" w:hAnsi="Times New Roman" w:cs="Times New Roman"/>
+          <w:b/>
+          <w:sz w:val="24"/>
+          <w:szCs w:val="24"/>
+        </w:rPr>
+        <w:t>5,9)=5</w:t>
+      </w:r>
+    </w:p>
+    <w:p>
+      <w:pPr>
+        <w:pStyle w:val="ListParagraph"/>
+        <w:spacing w:before="240" w:after="240" w:line="360" w:lineRule="auto"/>
+        <w:ind w:left="0"/>
+        <w:jc w:val="center"/>
+        <w:rPr>
+          <w:rFonts w:ascii="Times New Roman" w:hAnsi="Times New Roman" w:cs="Times New Roman"/>
+          <w:b/>
+          <w:sz w:val="24"/>
+          <w:szCs w:val="24"/>
+        </w:rPr>
+      </w:pPr>
+      <w:proofErr w:type="gramStart"/>
+      <w:r>
+        <w:rPr>
+          <w:rFonts w:ascii="Times New Roman" w:hAnsi="Times New Roman" w:cs="Times New Roman"/>
+          <w:b/>
+          <w:sz w:val="24"/>
+          <w:szCs w:val="24"/>
+        </w:rPr>
+        <w:t>min(</w:t>
+      </w:r>
+      <w:proofErr w:type="gramEnd"/>
+      <w:r>
+        <w:rPr>
+          <w:rFonts w:ascii="Times New Roman" w:hAnsi="Times New Roman" w:cs="Times New Roman"/>
+          <w:b/>
+          <w:sz w:val="24"/>
+          <w:szCs w:val="24"/>
+        </w:rPr>
+        <w:t xml:space="preserve">7,0)=0 </w:t>
       </w:r>
     </w:p>
     <w:p>
@@ -837,55 +1516,85 @@
         <w:ind w:left="90"/>
         <w:rPr>
           <w:rFonts w:ascii="Times New Roman" w:hAnsi="Times New Roman" w:cs="Times New Roman"/>
-          <w:sz w:val="24"/>
-          <w:szCs w:val="24"/>
-        </w:rPr>
-      </w:pPr>
-      <w:r>
-        <w:rPr>
-          <w:rFonts w:ascii="Times New Roman" w:hAnsi="Times New Roman" w:cs="Times New Roman"/>
-          <w:sz w:val="24"/>
-          <w:szCs w:val="24"/>
-        </w:rPr>
-        <w:t>The MIN</w:t>
-      </w:r>
-      <w:r>
-        <w:rPr>
-          <w:rFonts w:ascii="Times New Roman" w:hAnsi="Times New Roman" w:cs="Times New Roman"/>
-          <w:sz w:val="24"/>
-          <w:szCs w:val="24"/>
-        </w:rPr>
-        <w:t xml:space="preserve"> </w:t>
-      </w:r>
-      <w:r>
-        <w:rPr>
-          <w:rFonts w:ascii="Times New Roman" w:hAnsi="Times New Roman" w:cs="Times New Roman"/>
-          <w:sz w:val="24"/>
-          <w:szCs w:val="24"/>
-        </w:rPr>
-        <w:t>level values are 5 and 0.</w:t>
+          <w:b/>
+          <w:sz w:val="24"/>
+          <w:szCs w:val="24"/>
+        </w:rPr>
+      </w:pPr>
+      <w:r>
+        <w:rPr>
+          <w:rFonts w:ascii="Times New Roman" w:hAnsi="Times New Roman" w:cs="Times New Roman"/>
+          <w:b/>
+          <w:sz w:val="24"/>
+          <w:szCs w:val="24"/>
+        </w:rPr>
+        <w:t xml:space="preserve">Level 3 </w:t>
       </w:r>
     </w:p>
     <w:p>
       <w:pPr>
         <w:pStyle w:val="ListParagraph"/>
         <w:spacing w:before="240" w:after="240" w:line="360" w:lineRule="auto"/>
-        <w:ind w:left="90"/>
-        <w:rPr>
-          <w:rFonts w:ascii="Times New Roman" w:hAnsi="Times New Roman" w:cs="Times New Roman"/>
-          <w:b/>
-          <w:sz w:val="24"/>
-          <w:szCs w:val="24"/>
-        </w:rPr>
-      </w:pPr>
-      <w:r>
-        <w:rPr>
-          <w:rFonts w:ascii="Times New Roman" w:hAnsi="Times New Roman" w:cs="Times New Roman"/>
-          <w:b/>
-          <w:sz w:val="24"/>
-          <w:szCs w:val="24"/>
-        </w:rPr>
-        <w:t xml:space="preserve">Level 3 </w:t>
+        <w:ind w:left="0"/>
+        <w:rPr>
+          <w:rFonts w:ascii="Times New Roman" w:hAnsi="Times New Roman" w:cs="Times New Roman"/>
+          <w:sz w:val="24"/>
+          <w:szCs w:val="24"/>
+        </w:rPr>
+      </w:pPr>
+      <w:r>
+        <w:rPr>
+          <w:rFonts w:ascii="Times New Roman" w:hAnsi="Times New Roman" w:cs="Times New Roman"/>
+          <w:sz w:val="24"/>
+          <w:szCs w:val="24"/>
+        </w:rPr>
+        <w:t>As</w:t>
+      </w:r>
+      <w:r>
+        <w:rPr>
+          <w:rFonts w:ascii="Times New Roman" w:hAnsi="Times New Roman" w:cs="Times New Roman"/>
+          <w:sz w:val="24"/>
+          <w:szCs w:val="24"/>
+        </w:rPr>
+        <w:t xml:space="preserve"> stated in diagram </w:t>
+      </w:r>
+      <w:r>
+        <w:rPr>
+          <w:rFonts w:ascii="Times New Roman" w:hAnsi="Times New Roman" w:cs="Times New Roman"/>
+          <w:sz w:val="24"/>
+          <w:szCs w:val="24"/>
+        </w:rPr>
+        <w:t xml:space="preserve">the root </w:t>
+      </w:r>
+      <w:r>
+        <w:rPr>
+          <w:rFonts w:ascii="Times New Roman" w:hAnsi="Times New Roman" w:cs="Times New Roman"/>
+          <w:sz w:val="24"/>
+          <w:szCs w:val="24"/>
+        </w:rPr>
+        <w:t>Max chooses the largest value from each pair.</w:t>
+      </w:r>
+    </w:p>
+    <w:p>
+      <w:pPr>
+        <w:pStyle w:val="ListParagraph"/>
+        <w:spacing w:before="240" w:after="240" w:line="360" w:lineRule="auto"/>
+        <w:ind w:left="0"/>
+        <w:rPr>
+          <w:rFonts w:ascii="Times New Roman" w:hAnsi="Times New Roman" w:cs="Times New Roman"/>
+          <w:b/>
+          <w:sz w:val="24"/>
+          <w:szCs w:val="24"/>
+        </w:rPr>
+      </w:pPr>
+      <w:r>
+        <w:rPr>
+          <w:rFonts w:ascii="Times New Roman" w:hAnsi="Times New Roman" w:cs="Times New Roman"/>
+          <w:b/>
+          <w:sz w:val="24"/>
+          <w:szCs w:val="24"/>
+        </w:rPr>
+        <w:t>Hence;</w:t>
       </w:r>
     </w:p>
     <w:p>
@@ -901,11 +1610,19 @@
           <w:szCs w:val="24"/>
         </w:rPr>
       </w:pPr>
-      <w:r>
-        <w:t xml:space="preserve">max(5,0) =  </w:t>
-      </w:r>
-      <w:r>
-        <w:t>5</w:t>
+      <w:proofErr w:type="gramStart"/>
+      <w:r>
+        <w:rPr>
+          <w:b/>
+        </w:rPr>
+        <w:t>max(</w:t>
+      </w:r>
+      <w:proofErr w:type="gramEnd"/>
+      <w:r>
+        <w:rPr>
+          <w:b/>
+        </w:rPr>
+        <w:t>5,0) =  5</w:t>
       </w:r>
     </w:p>
     <w:p>
@@ -919,17 +1636,166 @@
           <w:szCs w:val="24"/>
         </w:rPr>
       </w:pPr>
-      <w:bookmarkStart w:id="0" w:name="_GoBack"/>
-      <w:bookmarkEnd w:id="0"/>
     </w:p>
     <w:sectPr>
+      <w:headerReference w:type="default" r:id="rId10"/>
+      <w:footerReference w:type="default" r:id="rId11"/>
       <w:pgSz w:w="12240" w:h="15840"/>
       <w:pgMar w:top="1440" w:right="1440" w:bottom="1440" w:left="1440" w:header="720" w:footer="720" w:gutter="0"/>
       <w:cols w:space="720"/>
+      <w:titlePg/>
       <w:docGrid w:linePitch="360"/>
     </w:sectPr>
   </w:body>
 </w:document>
+</file>
+
+<file path=word/endnotes.xml><?xml version="1.0" encoding="utf-8"?>
+<w:endnotes xmlns:wpc="http://schemas.microsoft.com/office/word/2010/wordprocessingCanvas" xmlns:cx="http://schemas.microsoft.com/office/drawing/2014/chartex" xmlns:cx1="http://schemas.microsoft.com/office/drawing/2015/9/8/chartex" xmlns:mc="http://schemas.openxmlformats.org/markup-compatibility/2006" xmlns:o="urn:schemas-microsoft-com:office:office" xmlns:r="http://schemas.openxmlformats.org/officeDocument/2006/relationships" xmlns:m="http://schemas.openxmlformats.org/officeDocument/2006/math" xmlns:v="urn:schemas-microsoft-com:vml" xmlns:wp14="http://schemas.microsoft.com/office/word/2010/wordprocessingDrawing" xmlns:wp="http://schemas.openxmlformats.org/drawingml/2006/wordprocessingDrawing" xmlns:w10="urn:schemas-microsoft-com:office:word" xmlns:w="http://schemas.openxmlformats.org/wordprocessingml/2006/main" xmlns:w14="http://schemas.microsoft.com/office/word/2010/wordml" xmlns:w15="http://schemas.microsoft.com/office/word/2012/wordml" xmlns:w16se="http://schemas.microsoft.com/office/word/2015/wordml/symex" xmlns:wpg="http://schemas.microsoft.com/office/word/2010/wordprocessingGroup" xmlns:wpi="http://schemas.microsoft.com/office/word/2010/wordprocessingInk" xmlns:wne="http://schemas.microsoft.com/office/word/2006/wordml" xmlns:wps="http://schemas.microsoft.com/office/word/2010/wordprocessingShape" mc:Ignorable="w14 w15 w16se wp14">
+  <w:endnote w:type="separator" w:id="-1">
+    <w:p>
+      <w:pPr>
+        <w:spacing w:after="0" w:line="240" w:lineRule="auto"/>
+      </w:pPr>
+      <w:r>
+        <w:separator/>
+      </w:r>
+    </w:p>
+  </w:endnote>
+  <w:endnote w:type="continuationSeparator" w:id="0">
+    <w:p>
+      <w:pPr>
+        <w:spacing w:after="0" w:line="240" w:lineRule="auto"/>
+      </w:pPr>
+      <w:r>
+        <w:continuationSeparator/>
+      </w:r>
+    </w:p>
+  </w:endnote>
+</w:endnotes>
+</file>
+
+<file path=word/footer1.xml><?xml version="1.0" encoding="utf-8"?>
+<w:ftr xmlns:wpc="http://schemas.microsoft.com/office/word/2010/wordprocessingCanvas" xmlns:cx="http://schemas.microsoft.com/office/drawing/2014/chartex" xmlns:cx1="http://schemas.microsoft.com/office/drawing/2015/9/8/chartex" xmlns:mc="http://schemas.openxmlformats.org/markup-compatibility/2006" xmlns:o="urn:schemas-microsoft-com:office:office" xmlns:r="http://schemas.openxmlformats.org/officeDocument/2006/relationships" xmlns:m="http://schemas.openxmlformats.org/officeDocument/2006/math" xmlns:v="urn:schemas-microsoft-com:vml" xmlns:wp14="http://schemas.microsoft.com/office/word/2010/wordprocessingDrawing" xmlns:wp="http://schemas.openxmlformats.org/drawingml/2006/wordprocessingDrawing" xmlns:w10="urn:schemas-microsoft-com:office:word" xmlns:w="http://schemas.openxmlformats.org/wordprocessingml/2006/main" xmlns:w14="http://schemas.microsoft.com/office/word/2010/wordml" xmlns:w15="http://schemas.microsoft.com/office/word/2012/wordml" xmlns:w16se="http://schemas.microsoft.com/office/word/2015/wordml/symex" xmlns:wpg="http://schemas.microsoft.com/office/word/2010/wordprocessingGroup" xmlns:wpi="http://schemas.microsoft.com/office/word/2010/wordprocessingInk" xmlns:wne="http://schemas.microsoft.com/office/word/2006/wordml" xmlns:wps="http://schemas.microsoft.com/office/word/2010/wordprocessingShape" mc:Ignorable="w14 w15 w16se wp14">
+  <w:sdt>
+    <w:sdtPr>
+      <w:id w:val="-107284403"/>
+      <w:docPartObj>
+        <w:docPartGallery w:val="Page Numbers (Bottom of Page)"/>
+        <w:docPartUnique/>
+      </w:docPartObj>
+    </w:sdtPr>
+    <w:sdtEndPr>
+      <w:rPr>
+        <w:color w:val="7F7F7F" w:themeColor="background1" w:themeShade="7F"/>
+        <w:spacing w:val="60"/>
+      </w:rPr>
+    </w:sdtEndPr>
+    <w:sdtContent>
+      <w:p>
+        <w:pPr>
+          <w:pStyle w:val="Footer"/>
+          <w:pBdr>
+            <w:top w:val="single" w:sz="4" w:space="1" w:color="D9D9D9" w:themeColor="background1" w:themeShade="D9"/>
+          </w:pBdr>
+          <w:jc w:val="right"/>
+        </w:pPr>
+        <w:r>
+          <w:fldChar w:fldCharType="begin"/>
+        </w:r>
+        <w:r>
+          <w:instrText xml:space="preserve"> PAGE   \* MERGEFORMAT </w:instrText>
+        </w:r>
+        <w:r>
+          <w:fldChar w:fldCharType="separate"/>
+        </w:r>
+        <w:r>
+          <w:rPr>
+            <w:noProof/>
+          </w:rPr>
+          <w:t>2</w:t>
+        </w:r>
+        <w:r>
+          <w:rPr>
+            <w:noProof/>
+          </w:rPr>
+          <w:fldChar w:fldCharType="end"/>
+        </w:r>
+        <w:r>
+          <w:t xml:space="preserve"> | </w:t>
+        </w:r>
+        <w:r>
+          <w:rPr>
+            <w:color w:val="7F7F7F" w:themeColor="background1" w:themeShade="7F"/>
+            <w:spacing w:val="60"/>
+          </w:rPr>
+          <w:t>Page</w:t>
+        </w:r>
+      </w:p>
+    </w:sdtContent>
+  </w:sdt>
+  <w:p>
+    <w:pPr>
+      <w:pStyle w:val="Footer"/>
+    </w:pPr>
+  </w:p>
+</w:ftr>
+</file>
+
+<file path=word/footnotes.xml><?xml version="1.0" encoding="utf-8"?>
+<w:footnotes xmlns:wpc="http://schemas.microsoft.com/office/word/2010/wordprocessingCanvas" xmlns:cx="http://schemas.microsoft.com/office/drawing/2014/chartex" xmlns:cx1="http://schemas.microsoft.com/office/drawing/2015/9/8/chartex" xmlns:mc="http://schemas.openxmlformats.org/markup-compatibility/2006" xmlns:o="urn:schemas-microsoft-com:office:office" xmlns:r="http://schemas.openxmlformats.org/officeDocument/2006/relationships" xmlns:m="http://schemas.openxmlformats.org/officeDocument/2006/math" xmlns:v="urn:schemas-microsoft-com:vml" xmlns:wp14="http://schemas.microsoft.com/office/word/2010/wordprocessingDrawing" xmlns:wp="http://schemas.openxmlformats.org/drawingml/2006/wordprocessingDrawing" xmlns:w10="urn:schemas-microsoft-com:office:word" xmlns:w="http://schemas.openxmlformats.org/wordprocessingml/2006/main" xmlns:w14="http://schemas.microsoft.com/office/word/2010/wordml" xmlns:w15="http://schemas.microsoft.com/office/word/2012/wordml" xmlns:w16se="http://schemas.microsoft.com/office/word/2015/wordml/symex" xmlns:wpg="http://schemas.microsoft.com/office/word/2010/wordprocessingGroup" xmlns:wpi="http://schemas.microsoft.com/office/word/2010/wordprocessingInk" xmlns:wne="http://schemas.microsoft.com/office/word/2006/wordml" xmlns:wps="http://schemas.microsoft.com/office/word/2010/wordprocessingShape" mc:Ignorable="w14 w15 w16se wp14">
+  <w:footnote w:type="separator" w:id="-1">
+    <w:p>
+      <w:pPr>
+        <w:spacing w:after="0" w:line="240" w:lineRule="auto"/>
+      </w:pPr>
+      <w:r>
+        <w:separator/>
+      </w:r>
+    </w:p>
+  </w:footnote>
+  <w:footnote w:type="continuationSeparator" w:id="0">
+    <w:p>
+      <w:pPr>
+        <w:spacing w:after="0" w:line="240" w:lineRule="auto"/>
+      </w:pPr>
+      <w:r>
+        <w:continuationSeparator/>
+      </w:r>
+    </w:p>
+  </w:footnote>
+</w:footnotes>
+</file>
+
+<file path=word/header1.xml><?xml version="1.0" encoding="utf-8"?>
+<w:hdr xmlns:wpc="http://schemas.microsoft.com/office/word/2010/wordprocessingCanvas" xmlns:cx="http://schemas.microsoft.com/office/drawing/2014/chartex" xmlns:cx1="http://schemas.microsoft.com/office/drawing/2015/9/8/chartex" xmlns:mc="http://schemas.openxmlformats.org/markup-compatibility/2006" xmlns:o="urn:schemas-microsoft-com:office:office" xmlns:r="http://schemas.openxmlformats.org/officeDocument/2006/relationships" xmlns:m="http://schemas.openxmlformats.org/officeDocument/2006/math" xmlns:v="urn:schemas-microsoft-com:vml" xmlns:wp14="http://schemas.microsoft.com/office/word/2010/wordprocessingDrawing" xmlns:wp="http://schemas.openxmlformats.org/drawingml/2006/wordprocessingDrawing" xmlns:w10="urn:schemas-microsoft-com:office:word" xmlns:w="http://schemas.openxmlformats.org/wordprocessingml/2006/main" xmlns:w14="http://schemas.microsoft.com/office/word/2010/wordml" xmlns:w15="http://schemas.microsoft.com/office/word/2012/wordml" xmlns:w16se="http://schemas.microsoft.com/office/word/2015/wordml/symex" xmlns:wpg="http://schemas.microsoft.com/office/word/2010/wordprocessingGroup" xmlns:wpi="http://schemas.microsoft.com/office/word/2010/wordprocessingInk" xmlns:wne="http://schemas.microsoft.com/office/word/2006/wordml" xmlns:wps="http://schemas.microsoft.com/office/word/2010/wordprocessingShape" mc:Ignorable="w14 w15 w16se wp14">
+  <w:p>
+    <w:pPr>
+      <w:pStyle w:val="Header"/>
+    </w:pPr>
+    <w:r>
+      <w:t xml:space="preserve">Muhammad Ahmed </w:t>
+    </w:r>
+    <w:proofErr w:type="spellStart"/>
+    <w:r>
+      <w:t>Subhani</w:t>
+    </w:r>
+    <w:proofErr w:type="spellEnd"/>
+    <w:r>
+      <w:tab/>
+      <w:t>018</w:t>
+    </w:r>
+    <w:r>
+      <w:tab/>
+      <w:t>4-A</w:t>
+    </w:r>
+  </w:p>
+  <w:p>
+    <w:pPr>
+      <w:pStyle w:val="Header"/>
+    </w:pPr>
+  </w:p>
+</w:hdr>
 </file>
 
 <file path=word/numbering.xml><?xml version="1.0" encoding="utf-8"?>
@@ -1110,6 +1976,95 @@
     </w:lvl>
   </w:abstractNum>
   <w:abstractNum w:abstractNumId="2" w15:restartNumberingAfterBreak="0">
+    <w:nsid w:val="17930857"/>
+    <w:multiLevelType w:val="hybridMultilevel"/>
+    <w:tmpl w:val="82C44210"/>
+    <w:lvl w:ilvl="0" w:tplc="0409000F">
+      <w:start w:val="1"/>
+      <w:numFmt w:val="decimal"/>
+      <w:lvlText w:val="%1."/>
+      <w:lvlJc w:val="left"/>
+      <w:pPr>
+        <w:ind w:left="720" w:hanging="360"/>
+      </w:pPr>
+      <w:rPr>
+        <w:rFonts w:hint="default"/>
+      </w:rPr>
+    </w:lvl>
+    <w:lvl w:ilvl="1" w:tplc="04090019" w:tentative="1">
+      <w:start w:val="1"/>
+      <w:numFmt w:val="lowerLetter"/>
+      <w:lvlText w:val="%2."/>
+      <w:lvlJc w:val="left"/>
+      <w:pPr>
+        <w:ind w:left="1440" w:hanging="360"/>
+      </w:pPr>
+    </w:lvl>
+    <w:lvl w:ilvl="2" w:tplc="0409001B" w:tentative="1">
+      <w:start w:val="1"/>
+      <w:numFmt w:val="lowerRoman"/>
+      <w:lvlText w:val="%3."/>
+      <w:lvlJc w:val="right"/>
+      <w:pPr>
+        <w:ind w:left="2160" w:hanging="180"/>
+      </w:pPr>
+    </w:lvl>
+    <w:lvl w:ilvl="3" w:tplc="0409000F" w:tentative="1">
+      <w:start w:val="1"/>
+      <w:numFmt w:val="decimal"/>
+      <w:lvlText w:val="%4."/>
+      <w:lvlJc w:val="left"/>
+      <w:pPr>
+        <w:ind w:left="2880" w:hanging="360"/>
+      </w:pPr>
+    </w:lvl>
+    <w:lvl w:ilvl="4" w:tplc="04090019" w:tentative="1">
+      <w:start w:val="1"/>
+      <w:numFmt w:val="lowerLetter"/>
+      <w:lvlText w:val="%5."/>
+      <w:lvlJc w:val="left"/>
+      <w:pPr>
+        <w:ind w:left="3600" w:hanging="360"/>
+      </w:pPr>
+    </w:lvl>
+    <w:lvl w:ilvl="5" w:tplc="0409001B" w:tentative="1">
+      <w:start w:val="1"/>
+      <w:numFmt w:val="lowerRoman"/>
+      <w:lvlText w:val="%6."/>
+      <w:lvlJc w:val="right"/>
+      <w:pPr>
+        <w:ind w:left="4320" w:hanging="180"/>
+      </w:pPr>
+    </w:lvl>
+    <w:lvl w:ilvl="6" w:tplc="0409000F" w:tentative="1">
+      <w:start w:val="1"/>
+      <w:numFmt w:val="decimal"/>
+      <w:lvlText w:val="%7."/>
+      <w:lvlJc w:val="left"/>
+      <w:pPr>
+        <w:ind w:left="5040" w:hanging="360"/>
+      </w:pPr>
+    </w:lvl>
+    <w:lvl w:ilvl="7" w:tplc="04090019" w:tentative="1">
+      <w:start w:val="1"/>
+      <w:numFmt w:val="lowerLetter"/>
+      <w:lvlText w:val="%8."/>
+      <w:lvlJc w:val="left"/>
+      <w:pPr>
+        <w:ind w:left="5760" w:hanging="360"/>
+      </w:pPr>
+    </w:lvl>
+    <w:lvl w:ilvl="8" w:tplc="0409001B" w:tentative="1">
+      <w:start w:val="1"/>
+      <w:numFmt w:val="lowerRoman"/>
+      <w:lvlText w:val="%9."/>
+      <w:lvlJc w:val="right"/>
+      <w:pPr>
+        <w:ind w:left="6480" w:hanging="180"/>
+      </w:pPr>
+    </w:lvl>
+  </w:abstractNum>
+  <w:abstractNum w:abstractNumId="3" w15:restartNumberingAfterBreak="0">
     <w:nsid w:val="200A5D64"/>
     <w:multiLevelType w:val="hybridMultilevel"/>
     <w:tmpl w:val="FD08DB36"/>
@@ -1195,7 +2150,7 @@
       </w:pPr>
     </w:lvl>
   </w:abstractNum>
-  <w:abstractNum w:abstractNumId="3" w15:restartNumberingAfterBreak="0">
+  <w:abstractNum w:abstractNumId="4" w15:restartNumberingAfterBreak="0">
     <w:nsid w:val="40DB530E"/>
     <w:multiLevelType w:val="hybridMultilevel"/>
     <w:tmpl w:val="849485A0"/>
@@ -1284,10 +2239,96 @@
       </w:pPr>
     </w:lvl>
   </w:abstractNum>
-  <w:abstractNum w:abstractNumId="4" w15:restartNumberingAfterBreak="0">
+  <w:abstractNum w:abstractNumId="5" w15:restartNumberingAfterBreak="0">
     <w:nsid w:val="5989173E"/>
     <w:multiLevelType w:val="hybridMultilevel"/>
     <w:tmpl w:val="C9929524"/>
+    <w:lvl w:ilvl="0" w:tplc="0409000F">
+      <w:start w:val="1"/>
+      <w:numFmt w:val="decimal"/>
+      <w:lvlText w:val="%1."/>
+      <w:lvlJc w:val="left"/>
+      <w:pPr>
+        <w:ind w:left="720" w:hanging="360"/>
+      </w:pPr>
+    </w:lvl>
+    <w:lvl w:ilvl="1" w:tplc="04090019" w:tentative="1">
+      <w:start w:val="1"/>
+      <w:numFmt w:val="lowerLetter"/>
+      <w:lvlText w:val="%2."/>
+      <w:lvlJc w:val="left"/>
+      <w:pPr>
+        <w:ind w:left="1440" w:hanging="360"/>
+      </w:pPr>
+    </w:lvl>
+    <w:lvl w:ilvl="2" w:tplc="0409001B" w:tentative="1">
+      <w:start w:val="1"/>
+      <w:numFmt w:val="lowerRoman"/>
+      <w:lvlText w:val="%3."/>
+      <w:lvlJc w:val="right"/>
+      <w:pPr>
+        <w:ind w:left="2160" w:hanging="180"/>
+      </w:pPr>
+    </w:lvl>
+    <w:lvl w:ilvl="3" w:tplc="0409000F" w:tentative="1">
+      <w:start w:val="1"/>
+      <w:numFmt w:val="decimal"/>
+      <w:lvlText w:val="%4."/>
+      <w:lvlJc w:val="left"/>
+      <w:pPr>
+        <w:ind w:left="2880" w:hanging="360"/>
+      </w:pPr>
+    </w:lvl>
+    <w:lvl w:ilvl="4" w:tplc="04090019" w:tentative="1">
+      <w:start w:val="1"/>
+      <w:numFmt w:val="lowerLetter"/>
+      <w:lvlText w:val="%5."/>
+      <w:lvlJc w:val="left"/>
+      <w:pPr>
+        <w:ind w:left="3600" w:hanging="360"/>
+      </w:pPr>
+    </w:lvl>
+    <w:lvl w:ilvl="5" w:tplc="0409001B" w:tentative="1">
+      <w:start w:val="1"/>
+      <w:numFmt w:val="lowerRoman"/>
+      <w:lvlText w:val="%6."/>
+      <w:lvlJc w:val="right"/>
+      <w:pPr>
+        <w:ind w:left="4320" w:hanging="180"/>
+      </w:pPr>
+    </w:lvl>
+    <w:lvl w:ilvl="6" w:tplc="0409000F" w:tentative="1">
+      <w:start w:val="1"/>
+      <w:numFmt w:val="decimal"/>
+      <w:lvlText w:val="%7."/>
+      <w:lvlJc w:val="left"/>
+      <w:pPr>
+        <w:ind w:left="5040" w:hanging="360"/>
+      </w:pPr>
+    </w:lvl>
+    <w:lvl w:ilvl="7" w:tplc="04090019" w:tentative="1">
+      <w:start w:val="1"/>
+      <w:numFmt w:val="lowerLetter"/>
+      <w:lvlText w:val="%8."/>
+      <w:lvlJc w:val="left"/>
+      <w:pPr>
+        <w:ind w:left="5760" w:hanging="360"/>
+      </w:pPr>
+    </w:lvl>
+    <w:lvl w:ilvl="8" w:tplc="0409001B" w:tentative="1">
+      <w:start w:val="1"/>
+      <w:numFmt w:val="lowerRoman"/>
+      <w:lvlText w:val="%9."/>
+      <w:lvlJc w:val="right"/>
+      <w:pPr>
+        <w:ind w:left="6480" w:hanging="180"/>
+      </w:pPr>
+    </w:lvl>
+  </w:abstractNum>
+  <w:abstractNum w:abstractNumId="6" w15:restartNumberingAfterBreak="0">
+    <w:nsid w:val="688B717A"/>
+    <w:multiLevelType w:val="hybridMultilevel"/>
+    <w:tmpl w:val="499AF4E4"/>
     <w:lvl w:ilvl="0" w:tplc="0409000F">
       <w:start w:val="1"/>
       <w:numFmt w:val="decimal"/>
@@ -1374,16 +2415,22 @@
     <w:abstractNumId w:val="1"/>
   </w:num>
   <w:num w:numId="2">
-    <w:abstractNumId w:val="2"/>
+    <w:abstractNumId w:val="3"/>
   </w:num>
   <w:num w:numId="3">
-    <w:abstractNumId w:val="3"/>
+    <w:abstractNumId w:val="4"/>
   </w:num>
   <w:num w:numId="4">
-    <w:abstractNumId w:val="4"/>
+    <w:abstractNumId w:val="5"/>
   </w:num>
   <w:num w:numId="5">
     <w:abstractNumId w:val="0"/>
+  </w:num>
+  <w:num w:numId="6">
+    <w:abstractNumId w:val="2"/>
+  </w:num>
+  <w:num w:numId="7">
+    <w:abstractNumId w:val="6"/>
   </w:num>
 </w:numbering>
 </file>
@@ -1810,7 +2857,6 @@
     <w:next w:val="Normal"/>
     <w:link w:val="Heading2Char"/>
     <w:uiPriority w:val="9"/>
-    <w:semiHidden/>
     <w:unhideWhenUsed/>
     <w:qFormat/>
     <w:rsid w:val="00F6010F"/>
@@ -1853,6 +2899,7 @@
   <w:style w:type="character" w:default="1" w:styleId="DefaultParagraphFont">
     <w:name w:val="Default Paragraph Font"/>
     <w:uiPriority w:val="1"/>
+    <w:semiHidden/>
     <w:unhideWhenUsed/>
   </w:style>
   <w:style w:type="table" w:default="1" w:styleId="TableNormal">
@@ -1963,7 +3010,6 @@
     <w:basedOn w:val="DefaultParagraphFont"/>
     <w:link w:val="Heading2"/>
     <w:uiPriority w:val="9"/>
-    <w:semiHidden/>
     <w:rsid w:val="00F6010F"/>
     <w:rPr>
       <w:rFonts w:asciiTheme="majorHAnsi" w:eastAsiaTheme="majorEastAsia" w:hAnsiTheme="majorHAnsi" w:cstheme="majorBidi"/>
@@ -2072,6 +3118,63 @@
     <w:name w:val="cursor-pointer"/>
     <w:basedOn w:val="DefaultParagraphFont"/>
     <w:rsid w:val="00BD69B6"/>
+  </w:style>
+  <w:style w:type="paragraph" w:styleId="Header">
+    <w:name w:val="header"/>
+    <w:basedOn w:val="Normal"/>
+    <w:link w:val="HeaderChar"/>
+    <w:uiPriority w:val="99"/>
+    <w:unhideWhenUsed/>
+    <w:rsid w:val="00DB268D"/>
+    <w:pPr>
+      <w:tabs>
+        <w:tab w:val="center" w:pos="4680"/>
+        <w:tab w:val="right" w:pos="9360"/>
+      </w:tabs>
+      <w:spacing w:after="0" w:line="240" w:lineRule="auto"/>
+    </w:pPr>
+  </w:style>
+  <w:style w:type="character" w:customStyle="1" w:styleId="HeaderChar">
+    <w:name w:val="Header Char"/>
+    <w:basedOn w:val="DefaultParagraphFont"/>
+    <w:link w:val="Header"/>
+    <w:uiPriority w:val="99"/>
+    <w:rsid w:val="00DB268D"/>
+  </w:style>
+  <w:style w:type="paragraph" w:styleId="Footer">
+    <w:name w:val="footer"/>
+    <w:basedOn w:val="Normal"/>
+    <w:link w:val="FooterChar"/>
+    <w:uiPriority w:val="99"/>
+    <w:unhideWhenUsed/>
+    <w:rsid w:val="00DB268D"/>
+    <w:pPr>
+      <w:tabs>
+        <w:tab w:val="center" w:pos="4680"/>
+        <w:tab w:val="right" w:pos="9360"/>
+      </w:tabs>
+      <w:spacing w:after="0" w:line="240" w:lineRule="auto"/>
+    </w:pPr>
+  </w:style>
+  <w:style w:type="character" w:customStyle="1" w:styleId="FooterChar">
+    <w:name w:val="Footer Char"/>
+    <w:basedOn w:val="DefaultParagraphFont"/>
+    <w:link w:val="Footer"/>
+    <w:uiPriority w:val="99"/>
+    <w:rsid w:val="00DB268D"/>
+  </w:style>
+  <w:style w:type="paragraph" w:styleId="TOC2">
+    <w:name w:val="toc 2"/>
+    <w:basedOn w:val="Normal"/>
+    <w:next w:val="Normal"/>
+    <w:autoRedefine/>
+    <w:uiPriority w:val="39"/>
+    <w:unhideWhenUsed/>
+    <w:rsid w:val="00213ADD"/>
+    <w:pPr>
+      <w:spacing w:after="100"/>
+      <w:ind w:left="220"/>
+    </w:pPr>
   </w:style>
 </w:styles>
 </file>
@@ -2468,7 +3571,7 @@
 </file>
 
 <file path=customXml/itemProps1.xml><?xml version="1.0" encoding="utf-8"?>
-<ds:datastoreItem xmlns:ds="http://schemas.openxmlformats.org/officeDocument/2006/customXml" ds:itemID="{B1334694-B01F-4333-AFC9-D8153395F139}">
+<ds:datastoreItem xmlns:ds="http://schemas.openxmlformats.org/officeDocument/2006/customXml" ds:itemID="{4148076C-4C8B-413B-8023-177EAFFD7C33}">
   <ds:schemaRefs>
     <ds:schemaRef ds:uri="http://schemas.openxmlformats.org/officeDocument/2006/bibliography"/>
   </ds:schemaRefs>

</xml_diff>